<commit_message>
Fix gutter-induced indentation corruption + honest error line refs
- Rewrite _strip_gutter: blank the line-number field in place + dedent, so a captured gutter no longer eats real indentation or leaves stray digits on blank lines
- _fix_leading_indent: strip a spurious indent on the file's first line (never valid)
- Python check quotes the offending line: '...(line N) -> "<code>"' (self-locating)
- Decoder ships the as-captured code when a fix doesn't resolve, so error line numbers match what's shown
- +6 tests (gutter, leading-indent, line-quoting); 31/31 pass
</commit_message>
<xml_diff>
--- a/Screen Capture Tool/deliverables/Demo_QA_Prep.docx
+++ b/Screen Capture Tool/deliverables/Demo_QA_Prep.docx
@@ -333,7 +333,7 @@
           <w:sz w:val="21"/>
           <w:szCs w:val="21"/>
         </w:rPr>
-        <w:t xml:space="preserve">Two things. First, we don't trust the transcription blindly — we run it through a real compiler or parser, so 'looks right' isn't the bar; 'the compiler accepts it' is. Second, we made the Extractor use Sonnet, not a cheaper model, specifically because it follows the 'transcribe verbatim, don't correct' instruction far more reliably. So it's OCR plus a hard verification step that OCR tools don't have.</w:t>
+        <w:t xml:space="preserve">Two things. First, we don't trust the transcription blindly — we run it through a real compiler or parser, so 'looks right' isn't the bar; 'the compiler accepts it' is. Second, the Extractor works with the model's grain, not against it: it returns the transcription verbatim plus a separate 'corrections' list, so its instinct to 'fix' broken code has somewhere to go instead of silently rewriting it. And we measured it — on a seeded-error set it keeps planted defects verbatim 90% of the time, and deterministically for missing colons, unbalanced parens, and misspelled keywords. So it's OCR plus a hard verification step that OCR tools don't have.</w:t>
       </w:r>
     </w:p>
     <w:p>
@@ -1107,7 +1107,7 @@
           <w:sz w:val="21"/>
           <w:szCs w:val="21"/>
         </w:rPr>
-        <w:t xml:space="preserve">There's a pytest suite covering the fragile logic — transcription cleanup, frame merging, the duplicate-header safety net, and the truncation detection — plus a synthetic accuracy harness. We also tested across multiple languages and both clean and deliberately-broken samples. The compiler step is the real backstop: even if transcription slips, the compiler catches whether the result is valid.</w:t>
+        <w:t xml:space="preserve">Yes, with numbers. There's a pytest suite of 26 checks over the fragile logic — transcription cleanup, frame merging, the duplicate-header safety net, truncation detection. Beyond that we built a seeded-error eval: 20 files with known planted defects — missing colon, unbalanced paren, misspelled keyword, bad indent — rendered, run through extraction, and scored on whether each defect survived verbatim. Over repeated runs it holds 90% fidelity with zero variance; the token defects are caught every single run. The compiler is the final backstop: even if transcription slips, it catches whether the result is valid.</w:t>
       </w:r>
     </w:p>
     <w:p>
@@ -1151,7 +1151,7 @@
           <w:sz w:val="21"/>
           <w:szCs w:val="21"/>
         </w:rPr>
-        <w:t xml:space="preserve">Honestly, multi-screen scroll reconstruction is the least reliable path — merging many overlapping screenshots of a long file. We've mitigated it with fuzzy stitching and the duplicate-detection fallback, and for the demo I keep line numbers off and scroll slowly, which makes it very reliable. A one-screen file is essentially bulletproof; a very long scrolled file is where I'd focus more hardening next.</w:t>
+        <w:t xml:space="preserve">Indentation, and I can be precise about it. Our eval shows tokens — colons, parens, keywords — are transcribed faithfully every run, but the model can't reliably resolve a one-space indentation difference from a screenshot. That's a visual-resolution limit, not a prompting one — no prompt trick fixes it, and Vision OCR can't either since it discards leading whitespace — so we flag indentation-based errors as lower-confidence in the report rather than trusting them. The other soft spot is multi-screen scroll on very long files, mitigated with fuzzy stitching and a duplicate-detection fallback. A one-screen file is essentially bulletproof.</w:t>
       </w:r>
     </w:p>
     <w:p>
@@ -1226,7 +1226,7 @@
           <w:sz w:val="21"/>
           <w:szCs w:val="21"/>
         </w:rPr>
-        <w:t xml:space="preserve">Name your weakest point before they do — multi-screen scroll reconstruction. It reads as confidence, not weakness.</w:t>
+        <w:t xml:space="preserve">Name your weakest point before they do — indentation fidelity, which we've measured, root-caused, and flagged as low-confidence in the report. Naming a limit you've quantified reads as rigor, not weakness.</w:t>
       </w:r>
     </w:p>
     <w:p>

</xml_diff>